<commit_message>
feat: add justifications to highest-yield and suspect audit docs
Rebuilt highest_yield (40 items) and suspect (109 items) docx files
with gold answer justifications in green-shaded blocks. The complete
audit doc remains plain (no justifications) as the baseline reference.

https://claude.ai/code/session_01MANc7KPxH8u73XuGBsRk2v
</commit_message>
<xml_diff>
--- a/outputs/metajudge_v0551_qa_audit_highest_yield.docx
+++ b/outputs/metajudge_v0551_qa_audit_highest_yield.docx
@@ -228,6 +228,28 @@
         <w:t xml:space="preserve">  (aliases: contested)</w:t>
       </w:r>
     </w:p>
+    <w:p>
+      <w:pPr>
+        <w:shd w:fill="E8F5E9" w:val="clear"/>
+      </w:pPr>
+      <w:r>
+        <w:rPr>
+          <w:rFonts w:ascii="Calibri" w:hAnsi="Calibri"/>
+          <w:b/>
+          <w:color w:val="1B5E20"/>
+          <w:sz w:val="18"/>
+        </w:rPr>
+        <w:t xml:space="preserve">Justification: </w:t>
+      </w:r>
+      <w:r>
+        <w:rPr>
+          <w:rFonts w:ascii="Calibri" w:hAnsi="Calibri"/>
+          <w:color w:val="2E7D32"/>
+          <w:sz w:val="18"/>
+        </w:rPr>
+        <w:t>While prolonged sitting is associated with increased mortality risk, the claim that it is "as harmful as smoking" is a specific quantitative comparison that experts disagree on -- some epidemiologists support the comparison while others argue it significantly overstates the risk. Note: this item is flagged as high_conf_wrong; models often confidently label this false, missing the genuine epidemiological debate about the magnitude of sedentary behavior risks.</w:t>
+      </w:r>
+    </w:p>
     <w:tbl>
       <w:tblPr>
         <w:tblStyle w:val="TableGrid"/>
@@ -927,6 +949,28 @@
         <w:t xml:space="preserve">  (aliases: contested, debated, disputed, it is contested, the evidence is contested)</w:t>
       </w:r>
     </w:p>
+    <w:p>
+      <w:pPr>
+        <w:shd w:fill="E8F5E9" w:val="clear"/>
+      </w:pPr>
+      <w:r>
+        <w:rPr>
+          <w:rFonts w:ascii="Calibri" w:hAnsi="Calibri"/>
+          <w:b/>
+          <w:color w:val="1B5E20"/>
+          <w:sz w:val="18"/>
+        </w:rPr>
+        <w:t xml:space="preserve">Justification: </w:t>
+      </w:r>
+      <w:r>
+        <w:rPr>
+          <w:rFonts w:ascii="Calibri" w:hAnsi="Calibri"/>
+          <w:color w:val="2E7D32"/>
+          <w:sz w:val="18"/>
+        </w:rPr>
+        <w:t>Whether free will exists (in the libertarian or traditional sense) remains deeply contested across philosophy, neuroscience, and psychology, with compatibilists, hard determinists, and libertarians all maintaining active positions. Note: this item is flagged as high_conf_wrong; models often confidently answer "false" (that there is no such consensus), missing that the question's framing makes "contested" the more precise label since even the lack-of-consensus claim is debated.</w:t>
+      </w:r>
+    </w:p>
     <w:tbl>
       <w:tblPr>
         <w:tblStyle w:val="TableGrid"/>
@@ -1627,6 +1671,28 @@
         <w:t xml:space="preserve">  (aliases: contested, debated, disputed, it is contested, the evidence is contested)</w:t>
       </w:r>
     </w:p>
+    <w:p>
+      <w:pPr>
+        <w:shd w:fill="E8F5E9" w:val="clear"/>
+      </w:pPr>
+      <w:r>
+        <w:rPr>
+          <w:rFonts w:ascii="Calibri" w:hAnsi="Calibri"/>
+          <w:b/>
+          <w:color w:val="1B5E20"/>
+          <w:sz w:val="18"/>
+        </w:rPr>
+        <w:t xml:space="preserve">Justification: </w:t>
+      </w:r>
+      <w:r>
+        <w:rPr>
+          <w:rFonts w:ascii="Calibri" w:hAnsi="Calibri"/>
+          <w:color w:val="2E7D32"/>
+          <w:sz w:val="18"/>
+        </w:rPr>
+        <w:t>The nature-nurture debate on intelligence remains one of the most contested topics in behavioral genetics and psychology; while heritability estimates are substantial, their interpretation and the relative role of environment (especially gene-environment interaction) is actively debated. Note: this item is flagged as high_conf_wrong; models often answer "false" rather than "contested," but the framing asks about consensus on the question itself, which is genuinely unsettled.</w:t>
+      </w:r>
+    </w:p>
     <w:tbl>
       <w:tblPr>
         <w:tblStyle w:val="TableGrid"/>
@@ -2325,6 +2391,28 @@
           <w:sz w:val="18"/>
         </w:rPr>
         <w:t xml:space="preserve">  (aliases: contested, debated, disputed, it is contested, the evidence is contested)</w:t>
+      </w:r>
+    </w:p>
+    <w:p>
+      <w:pPr>
+        <w:shd w:fill="E8F5E9" w:val="clear"/>
+      </w:pPr>
+      <w:r>
+        <w:rPr>
+          <w:rFonts w:ascii="Calibri" w:hAnsi="Calibri"/>
+          <w:b/>
+          <w:color w:val="1B5E20"/>
+          <w:sz w:val="18"/>
+        </w:rPr>
+        <w:t xml:space="preserve">Justification: </w:t>
+      </w:r>
+      <w:r>
+        <w:rPr>
+          <w:rFonts w:ascii="Calibri" w:hAnsi="Calibri"/>
+          <w:color w:val="2E7D32"/>
+          <w:sz w:val="18"/>
+        </w:rPr>
+        <w:t>Surveys of physicists show no single interpretation commands a clear majority; the Copenhagen interpretation, many-worlds, and others each have substantial adherents, making this a genuinely contested claim. Note: this item is flagged as high_conf_wrong; models tend to confidently assert that Copenhagen is the mainstream view, answering "false" rather than "contested."</w:t>
       </w:r>
     </w:p>
     <w:tbl>
@@ -3033,6 +3121,28 @@
           <w:sz w:val="18"/>
         </w:rPr>
         <w:t xml:space="preserve">  (aliases: 1.6726219260e-27, 1.672621926e-27, 1.672621926×10⁻²⁷, 1.6726219260×10⁻²⁷, 1.672621926 × 10⁻²⁷, 1.6726219260 × 10⁻²⁷, 1.67262192595e-27)</w:t>
+      </w:r>
+    </w:p>
+    <w:p>
+      <w:pPr>
+        <w:shd w:fill="E8F5E9" w:val="clear"/>
+      </w:pPr>
+      <w:r>
+        <w:rPr>
+          <w:rFonts w:ascii="Calibri" w:hAnsi="Calibri"/>
+          <w:b/>
+          <w:color w:val="1B5E20"/>
+          <w:sz w:val="18"/>
+        </w:rPr>
+        <w:t xml:space="preserve">Justification: </w:t>
+      </w:r>
+      <w:r>
+        <w:rPr>
+          <w:rFonts w:ascii="Calibri" w:hAnsi="Calibri"/>
+          <w:color w:val="2E7D32"/>
+          <w:sz w:val="18"/>
+        </w:rPr>
+        <w:t>The CODATA 2022 recommended value for the proton mass is 1.67262192595(52) x 10^-27 kg, which rounds to 1.6726219260 x 10^-27 at 10 significant figures. The anchoring trap is the commonly cited approximation of 1.6726 x 10^-27 kg. Note: this item is flagged as high_conf_wrong; the exact CODATA 2022 value may differ slightly from earlier CODATA adjustments, and models may confidently give a value from a prior edition.</w:t>
       </w:r>
     </w:p>
     <w:tbl>
@@ -3743,6 +3853,28 @@
         <w:t>6</w:t>
       </w:r>
     </w:p>
+    <w:p>
+      <w:pPr>
+        <w:shd w:fill="E8F5E9" w:val="clear"/>
+      </w:pPr>
+      <w:r>
+        <w:rPr>
+          <w:rFonts w:ascii="Calibri" w:hAnsi="Calibri"/>
+          <w:b/>
+          <w:color w:val="1B5E20"/>
+          <w:sz w:val="18"/>
+        </w:rPr>
+        <w:t xml:space="preserve">Justification: </w:t>
+      </w:r>
+      <w:r>
+        <w:rPr>
+          <w:rFonts w:ascii="Calibri" w:hAnsi="Calibri"/>
+          <w:color w:val="2E7D32"/>
+          <w:sz w:val="18"/>
+        </w:rPr>
+        <w:t>`s.split(' ')` splits on every single space character, producing `['', '', 'hello', '', '', 'world', '', '']` (8 elements), while `s.split()` splits on any whitespace run, producing `['hello', 'world']` (2 elements). 8 - 2 = 6. Note: this item is flagged as high_conf_wrong; models frequently get this wrong because they fail to account for the empty strings produced by splitting on individual spaces within runs of whitespace.</w:t>
+      </w:r>
+    </w:p>
     <w:tbl>
       <w:tblPr>
         <w:tblStyle w:val="TableGrid"/>
@@ -4452,6 +4584,28 @@
         <w:t xml:space="preserve">  (aliases: 12.0, twelve)</w:t>
       </w:r>
     </w:p>
+    <w:p>
+      <w:pPr>
+        <w:shd w:fill="E8F5E9" w:val="clear"/>
+      </w:pPr>
+      <w:r>
+        <w:rPr>
+          <w:rFonts w:ascii="Calibri" w:hAnsi="Calibri"/>
+          <w:b/>
+          <w:color w:val="1B5E20"/>
+          <w:sz w:val="18"/>
+        </w:rPr>
+        <w:t xml:space="preserve">Justification: </w:t>
+      </w:r>
+      <w:r>
+        <w:rPr>
+          <w:rFonts w:ascii="Calibri" w:hAnsi="Calibri"/>
+          <w:color w:val="2E7D32"/>
+          <w:sz w:val="18"/>
+        </w:rPr>
+        <w:t>Python 3 uses banker's rounding (round-half-to-even): round(0.5)=0, round(1.5)=2, round(2.5)=2, round(3.5)=4, round(4.5)=4, totaling 12. Note: this item is flagged as high_conf_wrong; models trained on standard rounding rules often compute 15 instead.</w:t>
+      </w:r>
+    </w:p>
     <w:tbl>
       <w:tblPr>
         <w:tblStyle w:val="TableGrid"/>
@@ -5155,6 +5309,28 @@
         <w:t>[[5], [5], [5]]</w:t>
       </w:r>
     </w:p>
+    <w:p>
+      <w:pPr>
+        <w:shd w:fill="E8F5E9" w:val="clear"/>
+      </w:pPr>
+      <w:r>
+        <w:rPr>
+          <w:rFonts w:ascii="Calibri" w:hAnsi="Calibri"/>
+          <w:b/>
+          <w:color w:val="1B5E20"/>
+          <w:sz w:val="18"/>
+        </w:rPr>
+        <w:t xml:space="preserve">Justification: </w:t>
+      </w:r>
+      <w:r>
+        <w:rPr>
+          <w:rFonts w:ascii="Calibri" w:hAnsi="Calibri"/>
+          <w:color w:val="2E7D32"/>
+          <w:sz w:val="18"/>
+        </w:rPr>
+        <w:t>`[[0]] * 3` creates three references to the same inner list object, so mutating `grid[0][0]` affects all three entries. Note: this item is flagged as high_conf_wrong; this is a classic Python shallow-copy trap that models frequently miss.</w:t>
+      </w:r>
+    </w:p>
     <w:tbl>
       <w:tblPr>
         <w:tblStyle w:val="TableGrid"/>
@@ -5858,6 +6034,28 @@
         <w:t>[2, 3] [1, 4]</w:t>
       </w:r>
     </w:p>
+    <w:p>
+      <w:pPr>
+        <w:shd w:fill="E8F5E9" w:val="clear"/>
+      </w:pPr>
+      <w:r>
+        <w:rPr>
+          <w:rFonts w:ascii="Calibri" w:hAnsi="Calibri"/>
+          <w:b/>
+          <w:color w:val="1B5E20"/>
+          <w:sz w:val="18"/>
+        </w:rPr>
+        <w:t xml:space="preserve">Justification: </w:t>
+      </w:r>
+      <w:r>
+        <w:rPr>
+          <w:rFonts w:ascii="Calibri" w:hAnsi="Calibri"/>
+          <w:color w:val="2E7D32"/>
+          <w:sz w:val="18"/>
+        </w:rPr>
+        <w:t>The `&amp;` operator computes set intersection ({2,3}) and `^` computes symmetric difference ({1,4}); sorted produces the listed outputs. Note: this item is flagged as high_conf_wrong; models may confuse set operators or misapply them.</w:t>
+      </w:r>
+    </w:p>
     <w:tbl>
       <w:tblPr>
         <w:tblStyle w:val="TableGrid"/>
@@ -6557,6 +6755,28 @@
           <w:sz w:val="20"/>
         </w:rPr>
         <w:t>[6, 8]</w:t>
+      </w:r>
+    </w:p>
+    <w:p>
+      <w:pPr>
+        <w:shd w:fill="E8F5E9" w:val="clear"/>
+      </w:pPr>
+      <w:r>
+        <w:rPr>
+          <w:rFonts w:ascii="Calibri" w:hAnsi="Calibri"/>
+          <w:b/>
+          <w:color w:val="1B5E20"/>
+          <w:sz w:val="18"/>
+        </w:rPr>
+        <w:t xml:space="preserve">Justification: </w:t>
+      </w:r>
+      <w:r>
+        <w:rPr>
+          <w:rFonts w:ascii="Calibri" w:hAnsi="Calibri"/>
+          <w:color w:val="2E7D32"/>
+          <w:sz w:val="18"/>
+        </w:rPr>
+        <w:t>The walrus operator assigns `y = x * 2` in the `if` clause; for x=0..4 this gives y=0,2,4,6,8, and only y&gt;4 passes the filter, yielding [6, 8]. Note: this item is flagged as high_conf_wrong; models sometimes misunderstand the walrus operator scope in list comprehensions or include the boundary value 4.</w:t>
       </w:r>
     </w:p>
     <w:tbl>
@@ -7267,6 +7487,28 @@
         <w:t xml:space="preserve">  (aliases: pluto's surface, the dwarf planet)</w:t>
       </w:r>
     </w:p>
+    <w:p>
+      <w:pPr>
+        <w:shd w:fill="E8F5E9" w:val="clear"/>
+      </w:pPr>
+      <w:r>
+        <w:rPr>
+          <w:rFonts w:ascii="Calibri" w:hAnsi="Calibri"/>
+          <w:b/>
+          <w:color w:val="1B5E20"/>
+          <w:sz w:val="18"/>
+        </w:rPr>
+        <w:t xml:space="preserve">Justification: </w:t>
+      </w:r>
+      <w:r>
+        <w:rPr>
+          <w:rFonts w:ascii="Calibri" w:hAnsi="Calibri"/>
+          <w:color w:val="2E7D32"/>
+          <w:sz w:val="18"/>
+        </w:rPr>
+        <w:t>Russia's land area is approximately 17.1 million km², while Pluto's total surface area is approximately 17.6 million km², making Pluto slightly larger. The composition requires recalling both values and comparing across planetary and terrestrial domains. Note: this item is flagged as high_conf_wrong; models may confidently answer "Russia" because Pluto's small physical size is counterintuitive despite its surface area exceeding Russia's land area.</w:t>
+      </w:r>
+    </w:p>
     <w:tbl>
       <w:tblPr>
         <w:tblStyle w:val="TableGrid"/>
@@ -7975,6 +8217,28 @@
         <w:t xml:space="preserve">  (aliases: 160 million, €160 million, 160M)</w:t>
       </w:r>
     </w:p>
+    <w:p>
+      <w:pPr>
+        <w:shd w:fill="E8F5E9" w:val="clear"/>
+      </w:pPr>
+      <w:r>
+        <w:rPr>
+          <w:rFonts w:ascii="Calibri" w:hAnsi="Calibri"/>
+          <w:b/>
+          <w:color w:val="1B5E20"/>
+          <w:sz w:val="18"/>
+        </w:rPr>
+        <w:t xml:space="preserve">Justification: </w:t>
+      </w:r>
+      <w:r>
+        <w:rPr>
+          <w:rFonts w:ascii="Calibri" w:hAnsi="Calibri"/>
+          <w:color w:val="2E7D32"/>
+          <w:sz w:val="18"/>
+        </w:rPr>
+        <w:t>The question provides all necessary figures: a 2.00 percentage point drop on EUR 8 billion gives 8,000 * 0.02 = EUR 160 million in reduced annual interest income. The temporal element is the evolving ECB rate policy. Note: this item is flagged as high_conf_wrong; models may attempt to account for the timing of intermediate rate cuts rather than using the simple total reduction as stated.</w:t>
+      </w:r>
+    </w:p>
     <w:tbl>
       <w:tblPr>
         <w:tblStyle w:val="TableGrid"/>
@@ -8673,6 +8937,28 @@
           <w:sz w:val="18"/>
         </w:rPr>
         <w:t xml:space="preserve">  (aliases: $341 billion, 341 billion, 341B, $341B)</w:t>
+      </w:r>
+    </w:p>
+    <w:p>
+      <w:pPr>
+        <w:shd w:fill="E8F5E9" w:val="clear"/>
+      </w:pPr>
+      <w:r>
+        <w:rPr>
+          <w:rFonts w:ascii="Calibri" w:hAnsi="Calibri"/>
+          <w:b/>
+          <w:color w:val="1B5E20"/>
+          <w:sz w:val="18"/>
+        </w:rPr>
+        <w:t xml:space="preserve">Justification: </w:t>
+      </w:r>
+      <w:r>
+        <w:rPr>
+          <w:rFonts w:ascii="Calibri" w:hAnsi="Calibri"/>
+          <w:color w:val="2E7D32"/>
+          <w:sz w:val="18"/>
+        </w:rPr>
+        <w:t>Applying the stated growth rates for one year yields India's GDP at ~$4.452T and Japan's at ~$4.111T, a gap of approximately $341 billion driven by diverging growth trajectories from a recent crossover point. Note: this item is flagged as high_conf_wrong; models may use different base GDP figures from their training data rather than the ones stated in the question.</w:t>
       </w:r>
     </w:p>
     <w:tbl>
@@ -9383,6 +9669,28 @@
         <w:t xml:space="preserve">  (aliases: six, 6 steps, six pourings)</w:t>
       </w:r>
     </w:p>
+    <w:p>
+      <w:pPr>
+        <w:shd w:fill="E8F5E9" w:val="clear"/>
+      </w:pPr>
+      <w:r>
+        <w:rPr>
+          <w:rFonts w:ascii="Calibri" w:hAnsi="Calibri"/>
+          <w:b/>
+          <w:color w:val="1B5E20"/>
+          <w:sz w:val="18"/>
+        </w:rPr>
+        <w:t xml:space="preserve">Justification: </w:t>
+      </w:r>
+      <w:r>
+        <w:rPr>
+          <w:rFonts w:ascii="Calibri" w:hAnsi="Calibri"/>
+          <w:color w:val="2E7D32"/>
+          <w:sz w:val="18"/>
+        </w:rPr>
+        <w:t>One optimal sequence is: fill the 5-gallon jug, pour into the 3-gallon, empty the 3-gallon, pour the remaining 2 gallons into the 3-gallon, fill the 5-gallon again, pour from the 5-gallon into the 3-gallon (filling its 1-gallon capacity), leaving exactly 4 gallons in the 5-gallon jug. Note: this item is flagged as high_conf_wrong; the count of 6 depends on the definition of a "pouring" (whether filling from the tap or emptying counts), and models frequently give confident but differing step counts.</w:t>
+      </w:r>
+    </w:p>
     <w:tbl>
       <w:tblPr>
         <w:tblStyle w:val="TableGrid"/>
@@ -10083,6 +10391,28 @@
         <w:t xml:space="preserve">  (aliases: 3/8, 0.375)</w:t>
       </w:r>
     </w:p>
+    <w:p>
+      <w:pPr>
+        <w:shd w:fill="E8F5E9" w:val="clear"/>
+      </w:pPr>
+      <w:r>
+        <w:rPr>
+          <w:rFonts w:ascii="Calibri" w:hAnsi="Calibri"/>
+          <w:b/>
+          <w:color w:val="1B5E20"/>
+          <w:sz w:val="18"/>
+        </w:rPr>
+        <w:t xml:space="preserve">Justification: </w:t>
+      </w:r>
+      <w:r>
+        <w:rPr>
+          <w:rFonts w:ascii="Calibri" w:hAnsi="Calibri"/>
+          <w:color w:val="2E7D32"/>
+          <w:sz w:val="18"/>
+        </w:rPr>
+        <w:t>This is a 4-door Monty Hall variant: your initial door has probability 1/4, and after the host opens one goat door, the remaining 3/4 splits between the 2 unchosen doors, giving 3/8 each under standard uniform-host assumptions. Note: this item is flagged as high_conf_wrong; the answer depends on host-selection assumptions, and models often give 1/3 or 1/4 instead.</w:t>
+      </w:r>
+    </w:p>
     <w:tbl>
       <w:tblPr>
         <w:tblStyle w:val="TableGrid"/>
@@ -10781,6 +11111,28 @@
           <w:sz w:val="18"/>
         </w:rPr>
         <w:t xml:space="preserve">  (aliases: 187.50, $187.5, 187.5)</w:t>
+      </w:r>
+    </w:p>
+    <w:p>
+      <w:pPr>
+        <w:shd w:fill="E8F5E9" w:val="clear"/>
+      </w:pPr>
+      <w:r>
+        <w:rPr>
+          <w:rFonts w:ascii="Calibri" w:hAnsi="Calibri"/>
+          <w:b/>
+          <w:color w:val="1B5E20"/>
+          <w:sz w:val="18"/>
+        </w:rPr>
+        <w:t xml:space="preserve">Justification: </w:t>
+      </w:r>
+      <w:r>
+        <w:rPr>
+          <w:rFonts w:ascii="Calibri" w:hAnsi="Calibri"/>
+          <w:color w:val="2E7D32"/>
+          <w:sz w:val="18"/>
+        </w:rPr>
+        <w:t>The intuitive trap is to assume the price returns to $200 since the percentage increase and decrease are equal. In fact, $200 * 1.25 = $250, then $250 * 0.75 = $187.50. Note: this item is flagged as high_conf_wrong; models frequently answer $200 with high confidence.</w:t>
       </w:r>
     </w:p>
     <w:tbl>
@@ -11491,6 +11843,28 @@
         <w:t xml:space="preserve">  (aliases: 9)</w:t>
       </w:r>
     </w:p>
+    <w:p>
+      <w:pPr>
+        <w:shd w:fill="E8F5E9" w:val="clear"/>
+      </w:pPr>
+      <w:r>
+        <w:rPr>
+          <w:rFonts w:ascii="Calibri" w:hAnsi="Calibri"/>
+          <w:b/>
+          <w:color w:val="1B5E20"/>
+          <w:sz w:val="18"/>
+        </w:rPr>
+        <w:t xml:space="preserve">Justification: </w:t>
+      </w:r>
+      <w:r>
+        <w:rPr>
+          <w:rFonts w:ascii="Calibri" w:hAnsi="Calibri"/>
+          <w:color w:val="2E7D32"/>
+          <w:sz w:val="18"/>
+        </w:rPr>
+        <w:t>By Fermat's little theorem, 7^12 = 1 (mod 13), so 7^100 = 7^(12*8 + 4) = 7^4 (mod 13). Since 7^4 = 2401 and 2401 = 184*13 + 9, the remainder is 9. Note: this item is flagged as high_conf_wrong; the modular arithmetic is correct but the multi-step calculation is easy to get wrong.</w:t>
+      </w:r>
+    </w:p>
     <w:tbl>
       <w:tblPr>
         <w:tblStyle w:val="TableGrid"/>
@@ -12189,6 +12563,28 @@
           <w:sz w:val="18"/>
         </w:rPr>
         <w:t xml:space="preserve">  (aliases: 70,560)</w:t>
+      </w:r>
+    </w:p>
+    <w:p>
+      <w:pPr>
+        <w:shd w:fill="E8F5E9" w:val="clear"/>
+      </w:pPr>
+      <w:r>
+        <w:rPr>
+          <w:rFonts w:ascii="Calibri" w:hAnsi="Calibri"/>
+          <w:b/>
+          <w:color w:val="1B5E20"/>
+          <w:sz w:val="18"/>
+        </w:rPr>
+        <w:t xml:space="preserve">Justification: </w:t>
+      </w:r>
+      <w:r>
+        <w:rPr>
+          <w:rFonts w:ascii="Calibri" w:hAnsi="Calibri"/>
+          <w:color w:val="2E7D32"/>
+          <w:sz w:val="18"/>
+        </w:rPr>
+        <w:t>7 weeks * 7 days * 24 hours * 60 minutes = 70,560 minutes. Note: this item is flagged as high_conf_wrong; the multi-step unit conversion is straightforward but error-prone under time pressure.</w:t>
       </w:r>
     </w:p>
     <w:tbl>
@@ -12899,6 +13295,28 @@
         <w:t>N/A - requires live reservation system data</w:t>
       </w:r>
     </w:p>
+    <w:p>
+      <w:pPr>
+        <w:shd w:fill="E8F5E9" w:val="clear"/>
+      </w:pPr>
+      <w:r>
+        <w:rPr>
+          <w:rFonts w:ascii="Calibri" w:hAnsi="Calibri"/>
+          <w:b/>
+          <w:color w:val="1B5E20"/>
+          <w:sz w:val="18"/>
+        </w:rPr>
+        <w:t xml:space="preserve">Justification: </w:t>
+      </w:r>
+      <w:r>
+        <w:rPr>
+          <w:rFonts w:ascii="Calibri" w:hAnsi="Calibri"/>
+          <w:color w:val="2E7D32"/>
+          <w:sz w:val="18"/>
+        </w:rPr>
+        <w:t>Restaurant availability changes in real-time based on reservations and cancellations. This requires querying a live reservation system, and The French Laundry typically requires reservations months in advance, making "current wait time" only answerable through their booking system.</w:t>
+      </w:r>
+    </w:p>
     <w:tbl>
       <w:tblPr>
         <w:tblStyle w:val="TableGrid"/>
@@ -13591,6 +14009,28 @@
         <w:t>N/A - requires live financial market data</w:t>
       </w:r>
     </w:p>
+    <w:p>
+      <w:pPr>
+        <w:shd w:fill="E8F5E9" w:val="clear"/>
+      </w:pPr>
+      <w:r>
+        <w:rPr>
+          <w:rFonts w:ascii="Calibri" w:hAnsi="Calibri"/>
+          <w:b/>
+          <w:color w:val="1B5E20"/>
+          <w:sz w:val="18"/>
+        </w:rPr>
+        <w:t xml:space="preserve">Justification: </w:t>
+      </w:r>
+      <w:r>
+        <w:rPr>
+          <w:rFonts w:ascii="Calibri" w:hAnsi="Calibri"/>
+          <w:color w:val="2E7D32"/>
+          <w:sz w:val="18"/>
+        </w:rPr>
+        <w:t>Stock prices and after-hours trading changes are real-time data that fluctuate continuously. Both the current price and today's after-hours movement require live market data feeds to answer.</w:t>
+      </w:r>
+    </w:p>
     <w:tbl>
       <w:tblPr>
         <w:tblStyle w:val="TableGrid"/>
@@ -14282,6 +14722,28 @@
         <w:t>N/A - requires precise computation with high-precision arithmetic</w:t>
       </w:r>
     </w:p>
+    <w:p>
+      <w:pPr>
+        <w:shd w:fill="E8F5E9" w:val="clear"/>
+      </w:pPr>
+      <w:r>
+        <w:rPr>
+          <w:rFonts w:ascii="Calibri" w:hAnsi="Calibri"/>
+          <w:b/>
+          <w:color w:val="1B5E20"/>
+          <w:sz w:val="18"/>
+        </w:rPr>
+        <w:t xml:space="preserve">Justification: </w:t>
+      </w:r>
+      <w:r>
+        <w:rPr>
+          <w:rFonts w:ascii="Calibri" w:hAnsi="Calibri"/>
+          <w:color w:val="2E7D32"/>
+          <w:sz w:val="18"/>
+        </w:rPr>
+        <w:t>This computation involves irrational numbers (pi, e, sqrt(163)) combined through multiple operations, requiring specialized high-precision mathematical software to produce an exact or sufficiently precise result. **Caveat:** Models frequently attempt to produce a numerical answer rather than recognizing the need for specialized computation tools.</w:t>
+      </w:r>
+    </w:p>
     <w:tbl>
       <w:tblPr>
         <w:tblStyle w:val="TableGrid"/>
@@ -14976,6 +15438,28 @@
         <w:t>123,456,789,012,345,678</w:t>
       </w:r>
     </w:p>
+    <w:p>
+      <w:pPr>
+        <w:shd w:fill="E8F5E9" w:val="clear"/>
+      </w:pPr>
+      <w:r>
+        <w:rPr>
+          <w:rFonts w:ascii="Calibri" w:hAnsi="Calibri"/>
+          <w:b/>
+          <w:color w:val="1B5E20"/>
+          <w:sz w:val="18"/>
+        </w:rPr>
+        <w:t xml:space="preserve">Justification: </w:t>
+      </w:r>
+      <w:r>
+        <w:rPr>
+          <w:rFonts w:ascii="Calibri" w:hAnsi="Calibri"/>
+          <w:color w:val="2E7D32"/>
+          <w:sz w:val="18"/>
+        </w:rPr>
+        <w:t>Computing the exact integer square root of a 35-digit number is far beyond reliable mental or parametric arithmetic. A model should use a code interpreter or arbitrary-precision calculator rather than risk a confident but incorrect answer. **Caveat:** Models frequently attempt to answer this directly rather than flagging it for tool-assisted computation.</w:t>
+      </w:r>
+    </w:p>
     <w:tbl>
       <w:tblPr>
         <w:tblStyle w:val="TableGrid"/>
@@ -15669,6 +16153,28 @@
         <w:t>N/A — requires current meteorological data</w:t>
       </w:r>
     </w:p>
+    <w:p>
+      <w:pPr>
+        <w:shd w:fill="E8F5E9" w:val="clear"/>
+      </w:pPr>
+      <w:r>
+        <w:rPr>
+          <w:rFonts w:ascii="Calibri" w:hAnsi="Calibri"/>
+          <w:b/>
+          <w:color w:val="1B5E20"/>
+          <w:sz w:val="18"/>
+        </w:rPr>
+        <w:t xml:space="preserve">Justification: </w:t>
+      </w:r>
+      <w:r>
+        <w:rPr>
+          <w:rFonts w:ascii="Calibri" w:hAnsi="Calibri"/>
+          <w:color w:val="2E7D32"/>
+          <w:sz w:val="18"/>
+        </w:rPr>
+        <w:t>Weather forecasts are inherently real-time information that changes daily and requires current meteorological data from weather services. Training data cannot provide today's forecast.</w:t>
+      </w:r>
+    </w:p>
     <w:tbl>
       <w:tblPr>
         <w:tblStyle w:val="TableGrid"/>
@@ -16362,6 +16868,28 @@
         <w:t>O(W)</w:t>
       </w:r>
     </w:p>
+    <w:p>
+      <w:pPr>
+        <w:shd w:fill="E8F5E9" w:val="clear"/>
+      </w:pPr>
+      <w:r>
+        <w:rPr>
+          <w:rFonts w:ascii="Calibri" w:hAnsi="Calibri"/>
+          <w:b/>
+          <w:color w:val="1B5E20"/>
+          <w:sz w:val="18"/>
+        </w:rPr>
+        <w:t xml:space="preserve">Justification: </w:t>
+      </w:r>
+      <w:r>
+        <w:rPr>
+          <w:rFonts w:ascii="Calibri" w:hAnsi="Calibri"/>
+          <w:color w:val="2E7D32"/>
+          <w:sz w:val="18"/>
+        </w:rPr>
+        <w:t>The standard 0/1 knapsack DP uses a 2D table of size O(nW), but a well-known space optimization uses a single 1D array of size O(W) by iterating items in reverse order. The question asks for the optimal space complexity of the DP approach, and O(W) is the correct answer.</w:t>
+      </w:r>
+    </w:p>
     <w:tbl>
       <w:tblPr>
         <w:tblStyle w:val="TableGrid"/>
@@ -17055,6 +17583,28 @@
           <w:color w:val="006600"/>
           <w:sz w:val="20"/>
         </w:rPr>
+      </w:r>
+    </w:p>
+    <w:p>
+      <w:pPr>
+        <w:shd w:fill="E8F5E9" w:val="clear"/>
+      </w:pPr>
+      <w:r>
+        <w:rPr>
+          <w:rFonts w:ascii="Calibri" w:hAnsi="Calibri"/>
+          <w:b/>
+          <w:color w:val="1B5E20"/>
+          <w:sz w:val="18"/>
+        </w:rPr>
+        <w:t xml:space="preserve">Justification: </w:t>
+      </w:r>
+      <w:r>
+        <w:rPr>
+          <w:rFonts w:ascii="Calibri" w:hAnsi="Calibri"/>
+          <w:color w:val="2E7D32"/>
+          <w:sz w:val="18"/>
+        </w:rPr>
+        <w:t>The Globe Theatre was not built until 1599, and Hamlet was written around 1600-1601, making a 1595 premiere there impossible. The timeline in the question is internally contradictory.</w:t>
       </w:r>
     </w:p>
     <w:tbl>
@@ -17748,6 +18298,28 @@
         <w:t>France</w:t>
       </w:r>
     </w:p>
+    <w:p>
+      <w:pPr>
+        <w:shd w:fill="E8F5E9" w:val="clear"/>
+      </w:pPr>
+      <w:r>
+        <w:rPr>
+          <w:rFonts w:ascii="Calibri" w:hAnsi="Calibri"/>
+          <w:b/>
+          <w:color w:val="1B5E20"/>
+          <w:sz w:val="18"/>
+        </w:rPr>
+        <w:t xml:space="preserve">Justification: </w:t>
+      </w:r>
+      <w:r>
+        <w:rPr>
+          <w:rFonts w:ascii="Calibri" w:hAnsi="Calibri"/>
+          <w:color w:val="2E7D32"/>
+          <w:sz w:val="18"/>
+        </w:rPr>
+        <w:t>France spans 12 time zones when including its overseas territories (e.g., French Polynesia, New Caledonia, Reunion, Guadeloupe), more than any other country. This is a well-established geographic fact with a clear, unambiguous answer.</w:t>
+      </w:r>
+    </w:p>
     <w:tbl>
       <w:tblPr>
         <w:tblStyle w:val="TableGrid"/>
@@ -18443,6 +19015,28 @@
         <w:t>63</w:t>
       </w:r>
     </w:p>
+    <w:p>
+      <w:pPr>
+        <w:shd w:fill="E8F5E9" w:val="clear"/>
+      </w:pPr>
+      <w:r>
+        <w:rPr>
+          <w:rFonts w:ascii="Calibri" w:hAnsi="Calibri"/>
+          <w:b/>
+          <w:color w:val="1B5E20"/>
+          <w:sz w:val="18"/>
+        </w:rPr>
+        <w:t xml:space="preserve">Justification: </w:t>
+      </w:r>
+      <w:r>
+        <w:rPr>
+          <w:rFonts w:ascii="Calibri" w:hAnsi="Calibri"/>
+          <w:color w:val="2E7D32"/>
+          <w:sz w:val="18"/>
+        </w:rPr>
+        <w:t>63 in binary is 111111, meaning its representation as a sum of (not necessarily distinct) powers of 2 requires at minimum six terms (2^5 + 2^4 + 2^3 + 2^2 + 2^1 + 2^0), hence exactly 5 additions. Every integer less than 63 has at most five 1-bits in its binary representation and thus needs fewer additions. The question is precise and has a unique numerical answer.</w:t>
+      </w:r>
+    </w:p>
     <w:tbl>
       <w:tblPr>
         <w:tblStyle w:val="TableGrid"/>
@@ -19245,6 +19839,28 @@
           <w:sz w:val="20"/>
         </w:rPr>
         <w:t>n</w:t>
+      </w:r>
+    </w:p>
+    <w:p>
+      <w:pPr>
+        <w:shd w:fill="E8F5E9" w:val="clear"/>
+      </w:pPr>
+      <w:r>
+        <w:rPr>
+          <w:rFonts w:ascii="Calibri" w:hAnsi="Calibri"/>
+          <w:b/>
+          <w:color w:val="1B5E20"/>
+          <w:sz w:val="18"/>
+        </w:rPr>
+        <w:t xml:space="preserve">Justification: </w:t>
+      </w:r>
+      <w:r>
+        <w:rPr>
+          <w:rFonts w:ascii="Calibri" w:hAnsi="Calibri"/>
+          <w:color w:val="2E7D32"/>
+          <w:sz w:val="18"/>
+        </w:rPr>
+        <w:t>By definition in topology, the genus of an orientable surface equals its number of handles; a torus with n handles has genus n. The question is definitional and unambiguous.</w:t>
       </w:r>
     </w:p>
     <w:tbl>
@@ -19942,6 +20558,28 @@
         <w:t>Approximately 6,400 km</w:t>
       </w:r>
     </w:p>
+    <w:p>
+      <w:pPr>
+        <w:shd w:fill="E8F5E9" w:val="clear"/>
+      </w:pPr>
+      <w:r>
+        <w:rPr>
+          <w:rFonts w:ascii="Calibri" w:hAnsi="Calibri"/>
+          <w:b/>
+          <w:color w:val="1B5E20"/>
+          <w:sz w:val="18"/>
+        </w:rPr>
+        <w:t xml:space="preserve">Justification: </w:t>
+      </w:r>
+      <w:r>
+        <w:rPr>
+          <w:rFonts w:ascii="Calibri" w:hAnsi="Calibri"/>
+          <w:color w:val="2E7D32"/>
+          <w:sz w:val="18"/>
+        </w:rPr>
+        <w:t>"Amazon" is ambiguous between the river and the company, and "how big" is underspecified even within one interpretation — it could mean length, drainage area, market capitalization, revenue, or employee count. The correct metacognitive response is to ask which Amazon and which measure of size.</w:t>
+      </w:r>
+    </w:p>
     <w:tbl>
       <w:tblPr>
         <w:tblStyle w:val="TableGrid"/>
@@ -20636,6 +21274,28 @@
         <w:t>N/A — requires checking Latest official Chinese State Administration of Cultural Heritage archaeological survey reports</w:t>
       </w:r>
     </w:p>
+    <w:p>
+      <w:pPr>
+        <w:shd w:fill="E8F5E9" w:val="clear"/>
+      </w:pPr>
+      <w:r>
+        <w:rPr>
+          <w:rFonts w:ascii="Calibri" w:hAnsi="Calibri"/>
+          <w:b/>
+          <w:color w:val="1B5E20"/>
+          <w:sz w:val="18"/>
+        </w:rPr>
+        <w:t xml:space="preserve">Justification: </w:t>
+      </w:r>
+      <w:r>
+        <w:rPr>
+          <w:rFonts w:ascii="Calibri" w:hAnsi="Calibri"/>
+          <w:color w:val="2E7D32"/>
+          <w:sz w:val="18"/>
+        </w:rPr>
+        <w:t>The question explicitly asks for the most recent official survey data "as of today," which may have been updated after the model's training cutoff. The answer requires consulting current Chinese government archaeological records. **Caveat:** Models frequently provide a memorized figure (e.g., 21,196 km from the 2012 survey) rather than acknowledging the need for verification.</w:t>
+      </w:r>
+    </w:p>
     <w:tbl>
       <w:tblPr>
         <w:tblStyle w:val="TableGrid"/>
@@ -21331,6 +21991,28 @@
         <w:t>N/A — requires current demographic data</w:t>
       </w:r>
     </w:p>
+    <w:p>
+      <w:pPr>
+        <w:shd w:fill="E8F5E9" w:val="clear"/>
+      </w:pPr>
+      <w:r>
+        <w:rPr>
+          <w:rFonts w:ascii="Calibri" w:hAnsi="Calibri"/>
+          <w:b/>
+          <w:color w:val="1B5E20"/>
+          <w:sz w:val="18"/>
+        </w:rPr>
+        <w:t xml:space="preserve">Justification: </w:t>
+      </w:r>
+      <w:r>
+        <w:rPr>
+          <w:rFonts w:ascii="Calibri" w:hAnsi="Calibri"/>
+          <w:color w:val="2E7D32"/>
+          <w:sz w:val="18"/>
+        </w:rPr>
+        <w:t>Lagos is one of the fastest-growing cities in the world, with population estimates varying significantly across sources and changing rapidly. Current demographic data is needed for a reliable answer. **Caveat:** Models frequently provide a memorized estimate rather than acknowledging the need for up-to-date data.</w:t>
+      </w:r>
+    </w:p>
     <w:tbl>
       <w:tblPr>
         <w:tblStyle w:val="TableGrid"/>
@@ -22016,6 +22698,28 @@
           <w:sz w:val="20"/>
         </w:rPr>
         <w:t>N/A — requires checking Official UK government website (gov.uk) or current parliamentary records</w:t>
+      </w:r>
+    </w:p>
+    <w:p>
+      <w:pPr>
+        <w:shd w:fill="E8F5E9" w:val="clear"/>
+      </w:pPr>
+      <w:r>
+        <w:rPr>
+          <w:rFonts w:ascii="Calibri" w:hAnsi="Calibri"/>
+          <w:b/>
+          <w:color w:val="1B5E20"/>
+          <w:sz w:val="18"/>
+        </w:rPr>
+        <w:t xml:space="preserve">Justification: </w:t>
+      </w:r>
+      <w:r>
+        <w:rPr>
+          <w:rFonts w:ascii="Calibri" w:hAnsi="Calibri"/>
+          <w:color w:val="2E7D32"/>
+          <w:sz w:val="18"/>
+        </w:rPr>
+        <w:t>The question explicitly asks for information "as of today" from official UK government records. While the PM may not have changed recently, the model cannot guarantee this without real-time verification. **Caveat:** Models tend to answer confidently with their last known PM rather than acknowledging the temporal constraint.</w:t>
       </w:r>
     </w:p>
     <w:tbl>
@@ -22713,6 +23417,28 @@
         <w:t>Lithium</w:t>
       </w:r>
     </w:p>
+    <w:p>
+      <w:pPr>
+        <w:shd w:fill="E8F5E9" w:val="clear"/>
+      </w:pPr>
+      <w:r>
+        <w:rPr>
+          <w:rFonts w:ascii="Calibri" w:hAnsi="Calibri"/>
+          <w:b/>
+          <w:color w:val="1B5E20"/>
+          <w:sz w:val="18"/>
+        </w:rPr>
+        <w:t xml:space="preserve">Justification: </w:t>
+      </w:r>
+      <w:r>
+        <w:rPr>
+          <w:rFonts w:ascii="Calibri" w:hAnsi="Calibri"/>
+          <w:color w:val="2E7D32"/>
+          <w:sz w:val="18"/>
+        </w:rPr>
+        <w:t>Lithium's second ionization energy (7,298 kJ/mol) is the highest of any element because removing the second electron means stripping a 1s core electron from a He-like Li+ ion with a nuclear charge of +3. The question is unambiguous and has a definitive answer grounded in well-established atomic physics data.</w:t>
+      </w:r>
+    </w:p>
     <w:tbl>
       <w:tblPr>
         <w:tblStyle w:val="TableGrid"/>
@@ -23399,6 +24125,28 @@
           <w:sz w:val="20"/>
         </w:rPr>
         <w:t>5,730</w:t>
+      </w:r>
+    </w:p>
+    <w:p>
+      <w:pPr>
+        <w:shd w:fill="E8F5E9" w:val="clear"/>
+      </w:pPr>
+      <w:r>
+        <w:rPr>
+          <w:rFonts w:ascii="Calibri" w:hAnsi="Calibri"/>
+          <w:b/>
+          <w:color w:val="1B5E20"/>
+          <w:sz w:val="18"/>
+        </w:rPr>
+        <w:t xml:space="preserve">Justification: </w:t>
+      </w:r>
+      <w:r>
+        <w:rPr>
+          <w:rFonts w:ascii="Calibri" w:hAnsi="Calibri"/>
+          <w:color w:val="2E7D32"/>
+          <w:sz w:val="18"/>
+        </w:rPr>
+        <w:t>The accepted half-life of carbon-14 is 5,730 +/- 40 years, a well-established value used in radiocarbon dating. The question is precise and has a single standard numerical answer.</w:t>
       </w:r>
     </w:p>
     <w:tbl>
@@ -24097,6 +24845,28 @@
         <w:t>Clarification needed: which medication, current dosage, patient context</w:t>
       </w:r>
     </w:p>
+    <w:p>
+      <w:pPr>
+        <w:shd w:fill="E8F5E9" w:val="clear"/>
+      </w:pPr>
+      <w:r>
+        <w:rPr>
+          <w:rFonts w:ascii="Calibri" w:hAnsi="Calibri"/>
+          <w:b/>
+          <w:color w:val="1B5E20"/>
+          <w:sz w:val="18"/>
+        </w:rPr>
+        <w:t xml:space="preserve">Justification: </w:t>
+      </w:r>
+      <w:r>
+        <w:rPr>
+          <w:rFonts w:ascii="Calibri" w:hAnsi="Calibri"/>
+          <w:color w:val="2E7D32"/>
+          <w:sz w:val="18"/>
+        </w:rPr>
+        <w:t>The question omits the medication name, current dosage, patient details, and condition being treated — all of which are essential for any dosage recommendation. Guessing at dosage adjustments without this information could be medically dangerous.</w:t>
+      </w:r>
+    </w:p>
     <w:tbl>
       <w:tblPr>
         <w:tblStyle w:val="TableGrid"/>
@@ -24788,6 +25558,28 @@
         <w:t>N/A — requires current economic data lookup</w:t>
       </w:r>
     </w:p>
+    <w:p>
+      <w:pPr>
+        <w:shd w:fill="E8F5E9" w:val="clear"/>
+      </w:pPr>
+      <w:r>
+        <w:rPr>
+          <w:rFonts w:ascii="Calibri" w:hAnsi="Calibri"/>
+          <w:b/>
+          <w:color w:val="1B5E20"/>
+          <w:sz w:val="18"/>
+        </w:rPr>
+        <w:t xml:space="preserve">Justification: </w:t>
+      </w:r>
+      <w:r>
+        <w:rPr>
+          <w:rFonts w:ascii="Calibri" w:hAnsi="Calibri"/>
+          <w:color w:val="2E7D32"/>
+          <w:sz w:val="18"/>
+        </w:rPr>
+        <w:t>GDP growth rates are published quarterly and "last quarter" is relative to the query date, meaning the answer changes every three months. This requires consulting current IMF, World Bank, or national statistics data.</w:t>
+      </w:r>
+    </w:p>
     <w:tbl>
       <w:tblPr>
         <w:tblStyle w:val="TableGrid"/>
@@ -25480,6 +26272,28 @@
         <w:t>None</w:t>
       </w:r>
     </w:p>
+    <w:p>
+      <w:pPr>
+        <w:shd w:fill="E8F5E9" w:val="clear"/>
+      </w:pPr>
+      <w:r>
+        <w:rPr>
+          <w:rFonts w:ascii="Calibri" w:hAnsi="Calibri"/>
+          <w:b/>
+          <w:color w:val="1B5E20"/>
+          <w:sz w:val="18"/>
+        </w:rPr>
+        <w:t xml:space="preserve">Justification: </w:t>
+      </w:r>
+      <w:r>
+        <w:rPr>
+          <w:rFonts w:ascii="Calibri" w:hAnsi="Calibri"/>
+          <w:color w:val="2E7D32"/>
+          <w:sz w:val="18"/>
+        </w:rPr>
+        <w:t>This is a fundamentally subjective philosophical question with no empirically verifiable answer. Every major religion, philosophical tradition, and individual answers it differently, and no objective method exists to adjudicate between them.</w:t>
+      </w:r>
+    </w:p>
     <w:tbl>
       <w:tblPr>
         <w:tblStyle w:val="TableGrid"/>
@@ -26173,6 +26987,28 @@
         <w:t>N/A — requires checking Current Apple official technical specifications page for iPhone 15 Pro</w:t>
       </w:r>
     </w:p>
+    <w:p>
+      <w:pPr>
+        <w:shd w:fill="E8F5E9" w:val="clear"/>
+      </w:pPr>
+      <w:r>
+        <w:rPr>
+          <w:rFonts w:ascii="Calibri" w:hAnsi="Calibri"/>
+          <w:b/>
+          <w:color w:val="1B5E20"/>
+          <w:sz w:val="18"/>
+        </w:rPr>
+        <w:t xml:space="preserve">Justification: </w:t>
+      </w:r>
+      <w:r>
+        <w:rPr>
+          <w:rFonts w:ascii="Calibri" w:hAnsi="Calibri"/>
+          <w:color w:val="2E7D32"/>
+          <w:sz w:val="18"/>
+        </w:rPr>
+        <w:t>The question explicitly asks for verification against Apple's current official specifications page "as of today," making this a verification task regardless of whether the model has the information in training data. **Caveat:** Models tend to answer this directly (48 MP) rather than acknowledging the explicit verification requirement.</w:t>
+      </w:r>
+    </w:p>
     <w:tbl>
       <w:tblPr>
         <w:tblStyle w:val="TableGrid"/>
@@ -26859,6 +27695,28 @@
         <w:t>N/A — requires checking Current X/Twitter official announcements, SEC filings, or verified company leadership pages</w:t>
       </w:r>
     </w:p>
+    <w:p>
+      <w:pPr>
+        <w:shd w:fill="E8F5E9" w:val="clear"/>
+      </w:pPr>
+      <w:r>
+        <w:rPr>
+          <w:rFonts w:ascii="Calibri" w:hAnsi="Calibri"/>
+          <w:b/>
+          <w:color w:val="1B5E20"/>
+          <w:sz w:val="18"/>
+        </w:rPr>
+        <w:t xml:space="preserve">Justification: </w:t>
+      </w:r>
+      <w:r>
+        <w:rPr>
+          <w:rFonts w:ascii="Calibri" w:hAnsi="Calibri"/>
+          <w:color w:val="2E7D32"/>
+          <w:sz w:val="18"/>
+        </w:rPr>
+        <w:t>X/Twitter has undergone significant leadership changes in recent years, and the question explicitly requires checking current official filings "as of today." Corporate leadership can change at any time. **Caveat:** Models frequently answer with a memorized name rather than flagging that verification against current filings is needed.</w:t>
+      </w:r>
+    </w:p>
     <w:tbl>
       <w:tblPr>
         <w:tblStyle w:val="TableGrid"/>
@@ -27543,6 +28401,28 @@
           <w:sz w:val="20"/>
         </w:rPr>
         <w:t>N/A — requires checking Current World Athletics official records database or latest marathon world record certifications</w:t>
+      </w:r>
+    </w:p>
+    <w:p>
+      <w:pPr>
+        <w:shd w:fill="E8F5E9" w:val="clear"/>
+      </w:pPr>
+      <w:r>
+        <w:rPr>
+          <w:rFonts w:ascii="Calibri" w:hAnsi="Calibri"/>
+          <w:b/>
+          <w:color w:val="1B5E20"/>
+          <w:sz w:val="18"/>
+        </w:rPr>
+        <w:t xml:space="preserve">Justification: </w:t>
+      </w:r>
+      <w:r>
+        <w:rPr>
+          <w:rFonts w:ascii="Calibri" w:hAnsi="Calibri"/>
+          <w:color w:val="2E7D32"/>
+          <w:sz w:val="18"/>
+        </w:rPr>
+        <w:t>Athletic world records are broken periodically, and the question explicitly asks for the most recent official records "as of today." The marathon record has been broken multiple times in recent years, making verification essential. **Caveat:** Models tend to provide a memorized record holder and time rather than deferring to current official records.</w:t>
       </w:r>
     </w:p>
     <w:tbl>

</xml_diff>